<commit_message>
update trackers and project status
</commit_message>
<xml_diff>
--- a/guiding-principles/Policy_Domains/Healthcare/Communication/Care Delivery Reform Overview.docx
+++ b/guiding-principles/Policy_Domains/Healthcare/Communication/Care Delivery Reform Overview.docx
@@ -572,13 +572,28 @@
         <w:pStyle w:val="NormalWeb"/>
       </w:pPr>
       <w:r>
-        <w:t>Picture owning a car. For most day-to-day car ownership, gas, oil changes, car washes, you pay directly. Some things cost more than others, but each item is shoppable. If someone charges ten dollars for a gallon of gas, you drive down the street</w:t>
+        <w:t>Picture owning a car. For most day-to-day car ownership</w:t>
+      </w:r>
+      <w:r>
+        <w:t xml:space="preserve"> (</w:t>
+      </w:r>
+      <w:r>
+        <w:t>gas, oil changes, car washes</w:t>
+      </w:r>
+      <w:r>
+        <w:t xml:space="preserve">, etc.) </w:t>
+      </w:r>
+      <w:r>
+        <w:t>you pay directly. Some things cost more than others, but each item is shoppable. If someone charges ten dollars for a gallon of gas, you drive down the street</w:t>
       </w:r>
       <w:r>
         <w:t xml:space="preserve"> and go somewhere else</w:t>
       </w:r>
       <w:r>
-        <w:t xml:space="preserve">. For the things you genuinely cannot shop for: </w:t>
+        <w:t>. For the things you genuinely cannot shop for</w:t>
+      </w:r>
+      <w:r>
+        <w:t xml:space="preserve"> (</w:t>
       </w:r>
       <w:r>
         <w:t xml:space="preserve">car </w:t>
@@ -591,6 +606,9 @@
       </w:r>
       <w:r>
         <w:t>.</w:t>
+      </w:r>
+      <w:r>
+        <w:t>)</w:t>
       </w:r>
       <w:r>
         <w:t>, y</w:t>
@@ -3006,281 +3024,70 @@
     </w:p>
     <w:p>
       <w:pPr>
-        <w:spacing w:before="100" w:beforeAutospacing="1" w:after="100" w:afterAutospacing="1" w:line="240" w:lineRule="auto"/>
-        <w:rPr>
-          <w:rFonts w:ascii="Times New Roman" w:eastAsia="Times New Roman" w:hAnsi="Times New Roman" w:cs="Times New Roman"/>
-          <w:kern w:val="0"/>
-          <w14:ligatures w14:val="none"/>
-        </w:rPr>
-      </w:pPr>
-      <w:r>
-        <w:rPr>
-          <w:rFonts w:ascii="Times New Roman" w:eastAsia="Times New Roman" w:hAnsi="Times New Roman" w:cs="Times New Roman"/>
-          <w:kern w:val="0"/>
-          <w14:ligatures w14:val="none"/>
-        </w:rPr>
+        <w:pStyle w:val="NormalWeb"/>
+      </w:pPr>
+      <w:r>
         <w:lastRenderedPageBreak/>
-        <w:t xml:space="preserve">All of this runs on a new identity and privacy infrastructure. Your medical records follow you in a </w:t>
-      </w:r>
-      <w:r>
-        <w:rPr>
-          <w:rFonts w:ascii="Times New Roman" w:eastAsia="Times New Roman" w:hAnsi="Times New Roman" w:cs="Times New Roman"/>
-          <w:kern w:val="0"/>
-          <w14:ligatures w14:val="none"/>
-        </w:rPr>
-        <w:t xml:space="preserve">digital </w:t>
-      </w:r>
-      <w:r>
-        <w:rPr>
-          <w:rFonts w:ascii="Times New Roman" w:eastAsia="Times New Roman" w:hAnsi="Times New Roman" w:cs="Times New Roman"/>
-          <w:kern w:val="0"/>
-          <w14:ligatures w14:val="none"/>
-        </w:rPr>
-        <w:t>data vault</w:t>
-      </w:r>
-      <w:r>
-        <w:rPr>
-          <w:rFonts w:ascii="Times New Roman" w:eastAsia="Times New Roman" w:hAnsi="Times New Roman" w:cs="Times New Roman"/>
-          <w:kern w:val="0"/>
-          <w14:ligatures w14:val="none"/>
-        </w:rPr>
-        <w:t>. You control them. You decide what to disclose and to whom. You</w:t>
-      </w:r>
-      <w:r>
-        <w:rPr>
-          <w:rFonts w:ascii="Times New Roman" w:eastAsia="Times New Roman" w:hAnsi="Times New Roman" w:cs="Times New Roman"/>
-          <w:kern w:val="0"/>
-          <w14:ligatures w14:val="none"/>
-        </w:rPr>
-        <w:t xml:space="preserve"> no longer have to share your raw data, and your healthcare information </w:t>
-      </w:r>
-      <w:r>
-        <w:rPr>
-          <w:rFonts w:ascii="Times New Roman" w:eastAsia="Times New Roman" w:hAnsi="Times New Roman" w:cs="Times New Roman"/>
-          <w:kern w:val="0"/>
-          <w14:ligatures w14:val="none"/>
-        </w:rPr>
-        <w:t xml:space="preserve">is no longer fragmented across ten different doctors' offices and insurance companies </w:t>
-      </w:r>
-      <w:r>
-        <w:rPr>
-          <w:rFonts w:ascii="Times New Roman" w:eastAsia="Times New Roman" w:hAnsi="Times New Roman" w:cs="Times New Roman"/>
-          <w:kern w:val="0"/>
-          <w14:ligatures w14:val="none"/>
-        </w:rPr>
-        <w:t xml:space="preserve">where </w:t>
-      </w:r>
-      <w:r>
-        <w:rPr>
-          <w:rFonts w:ascii="Times New Roman" w:eastAsia="Times New Roman" w:hAnsi="Times New Roman" w:cs="Times New Roman"/>
-          <w:kern w:val="0"/>
-          <w14:ligatures w14:val="none"/>
-        </w:rPr>
-        <w:t>each hold</w:t>
-      </w:r>
-      <w:r>
-        <w:rPr>
-          <w:rFonts w:ascii="Times New Roman" w:eastAsia="Times New Roman" w:hAnsi="Times New Roman" w:cs="Times New Roman"/>
-          <w:kern w:val="0"/>
-          <w14:ligatures w14:val="none"/>
-        </w:rPr>
-        <w:t>s</w:t>
-      </w:r>
-      <w:r>
-        <w:rPr>
-          <w:rFonts w:ascii="Times New Roman" w:eastAsia="Times New Roman" w:hAnsi="Times New Roman" w:cs="Times New Roman"/>
-          <w:kern w:val="0"/>
-          <w14:ligatures w14:val="none"/>
-        </w:rPr>
-        <w:t xml:space="preserve"> a piece of it and none of whom can see the whole picture.</w:t>
-      </w:r>
-    </w:p>
-    <w:p>
-      <w:pPr>
-        <w:spacing w:before="100" w:beforeAutospacing="1" w:after="100" w:afterAutospacing="1" w:line="240" w:lineRule="auto"/>
-        <w:rPr>
-          <w:rFonts w:ascii="Times New Roman" w:eastAsia="Times New Roman" w:hAnsi="Times New Roman" w:cs="Times New Roman"/>
-          <w:kern w:val="0"/>
-          <w14:ligatures w14:val="none"/>
-        </w:rPr>
-      </w:pPr>
-      <w:r>
-        <w:rPr>
-          <w:rFonts w:ascii="Times New Roman" w:eastAsia="Times New Roman" w:hAnsi="Times New Roman" w:cs="Times New Roman"/>
-          <w:kern w:val="0"/>
-          <w14:ligatures w14:val="none"/>
-        </w:rPr>
-        <w:t xml:space="preserve">For the system to </w:t>
-      </w:r>
-      <w:r>
-        <w:rPr>
-          <w:rFonts w:ascii="Times New Roman" w:eastAsia="Times New Roman" w:hAnsi="Times New Roman" w:cs="Times New Roman"/>
-          <w:kern w:val="0"/>
-          <w14:ligatures w14:val="none"/>
-        </w:rPr>
-        <w:t>function</w:t>
-      </w:r>
-      <w:r>
-        <w:rPr>
-          <w:rFonts w:ascii="Times New Roman" w:eastAsia="Times New Roman" w:hAnsi="Times New Roman" w:cs="Times New Roman"/>
-          <w:kern w:val="0"/>
-          <w14:ligatures w14:val="none"/>
-        </w:rPr>
-        <w:t xml:space="preserve"> --</w:t>
-      </w:r>
-      <w:r>
-        <w:rPr>
-          <w:rFonts w:ascii="Times New Roman" w:eastAsia="Times New Roman" w:hAnsi="Times New Roman" w:cs="Times New Roman"/>
-          <w:kern w:val="0"/>
-          <w14:ligatures w14:val="none"/>
-        </w:rPr>
-        <w:t xml:space="preserve"> </w:t>
-      </w:r>
-      <w:r>
-        <w:rPr>
-          <w:rFonts w:ascii="Times New Roman" w:eastAsia="Times New Roman" w:hAnsi="Times New Roman" w:cs="Times New Roman"/>
-          <w:kern w:val="0"/>
-          <w14:ligatures w14:val="none"/>
-        </w:rPr>
-        <w:t>for</w:t>
-      </w:r>
-      <w:r>
-        <w:rPr>
-          <w:rFonts w:ascii="Times New Roman" w:eastAsia="Times New Roman" w:hAnsi="Times New Roman" w:cs="Times New Roman"/>
-          <w:kern w:val="0"/>
-          <w14:ligatures w14:val="none"/>
-        </w:rPr>
-        <w:t xml:space="preserve"> the discount to be calculated</w:t>
-      </w:r>
-      <w:r>
-        <w:rPr>
-          <w:rFonts w:ascii="Times New Roman" w:eastAsia="Times New Roman" w:hAnsi="Times New Roman" w:cs="Times New Roman"/>
-          <w:kern w:val="0"/>
-          <w14:ligatures w14:val="none"/>
-        </w:rPr>
-        <w:t xml:space="preserve"> --</w:t>
-      </w:r>
-      <w:r>
-        <w:rPr>
-          <w:rFonts w:ascii="Times New Roman" w:eastAsia="Times New Roman" w:hAnsi="Times New Roman" w:cs="Times New Roman"/>
-          <w:kern w:val="0"/>
-          <w14:ligatures w14:val="none"/>
-        </w:rPr>
-        <w:t xml:space="preserve"> for coverage to be confirmed</w:t>
-      </w:r>
-      <w:r>
-        <w:rPr>
-          <w:rFonts w:ascii="Times New Roman" w:eastAsia="Times New Roman" w:hAnsi="Times New Roman" w:cs="Times New Roman"/>
-          <w:kern w:val="0"/>
-          <w14:ligatures w14:val="none"/>
-        </w:rPr>
-        <w:t xml:space="preserve"> --</w:t>
-      </w:r>
-      <w:r>
-        <w:rPr>
-          <w:rFonts w:ascii="Times New Roman" w:eastAsia="Times New Roman" w:hAnsi="Times New Roman" w:cs="Times New Roman"/>
-          <w:kern w:val="0"/>
-          <w14:ligatures w14:val="none"/>
-        </w:rPr>
-        <w:t xml:space="preserve"> for payment to settle</w:t>
-      </w:r>
-      <w:r>
-        <w:rPr>
-          <w:rFonts w:ascii="Times New Roman" w:eastAsia="Times New Roman" w:hAnsi="Times New Roman" w:cs="Times New Roman"/>
-          <w:kern w:val="0"/>
-          <w14:ligatures w14:val="none"/>
-        </w:rPr>
-        <w:t xml:space="preserve"> --</w:t>
-      </w:r>
-      <w:r>
-        <w:rPr>
-          <w:rFonts w:ascii="Times New Roman" w:eastAsia="Times New Roman" w:hAnsi="Times New Roman" w:cs="Times New Roman"/>
-          <w:kern w:val="0"/>
-          <w14:ligatures w14:val="none"/>
-        </w:rPr>
-        <w:t xml:space="preserve"> I</w:t>
-      </w:r>
-      <w:r>
-        <w:rPr>
-          <w:rFonts w:ascii="Times New Roman" w:eastAsia="Times New Roman" w:hAnsi="Times New Roman" w:cs="Times New Roman"/>
-          <w:kern w:val="0"/>
-          <w14:ligatures w14:val="none"/>
-        </w:rPr>
-        <w:t>t needs to verify things about you. It does this through privacy-preserving proofs</w:t>
-      </w:r>
-      <w:r>
-        <w:rPr>
-          <w:rFonts w:ascii="Times New Roman" w:eastAsia="Times New Roman" w:hAnsi="Times New Roman" w:cs="Times New Roman"/>
-          <w:kern w:val="0"/>
-          <w14:ligatures w14:val="none"/>
-        </w:rPr>
-        <w:t xml:space="preserve"> -- </w:t>
-      </w:r>
-      <w:r>
-        <w:rPr>
-          <w:rFonts w:ascii="Times New Roman" w:eastAsia="Times New Roman" w:hAnsi="Times New Roman" w:cs="Times New Roman"/>
-          <w:kern w:val="0"/>
-          <w14:ligatures w14:val="none"/>
-        </w:rPr>
-        <w:t xml:space="preserve">yes or no questions about whether you qualify for a discount based on the </w:t>
-      </w:r>
-      <w:r>
-        <w:rPr>
-          <w:rFonts w:ascii="Times New Roman" w:eastAsia="Times New Roman" w:hAnsi="Times New Roman" w:cs="Times New Roman"/>
-          <w:kern w:val="0"/>
-          <w14:ligatures w14:val="none"/>
-        </w:rPr>
-        <w:t>preconditions</w:t>
-      </w:r>
-      <w:r>
-        <w:rPr>
-          <w:rFonts w:ascii="Times New Roman" w:eastAsia="Times New Roman" w:hAnsi="Times New Roman" w:cs="Times New Roman"/>
-          <w:kern w:val="0"/>
-          <w14:ligatures w14:val="none"/>
-        </w:rPr>
-        <w:t xml:space="preserve"> stored in your data vault.</w:t>
-      </w:r>
-      <w:r>
-        <w:rPr>
-          <w:rFonts w:ascii="Times New Roman" w:eastAsia="Times New Roman" w:hAnsi="Times New Roman" w:cs="Times New Roman"/>
-          <w:kern w:val="0"/>
-          <w14:ligatures w14:val="none"/>
-        </w:rPr>
-        <w:t xml:space="preserve"> The system </w:t>
-      </w:r>
-      <w:r>
-        <w:rPr>
-          <w:rFonts w:ascii="Times New Roman" w:eastAsia="Times New Roman" w:hAnsi="Times New Roman" w:cs="Times New Roman"/>
-          <w:kern w:val="0"/>
-          <w14:ligatures w14:val="none"/>
-        </w:rPr>
-        <w:t xml:space="preserve">automatically </w:t>
-      </w:r>
-      <w:r>
-        <w:rPr>
-          <w:rFonts w:ascii="Times New Roman" w:eastAsia="Times New Roman" w:hAnsi="Times New Roman" w:cs="Times New Roman"/>
-          <w:kern w:val="0"/>
-          <w14:ligatures w14:val="none"/>
-        </w:rPr>
-        <w:t>confirms you are eligible for a discount without seeing your income. It confirms you are covered without transmitting your medical history. Providers see a confirmed payment. You see your records. Nobody sees more than they need to do their job.</w:t>
-      </w:r>
-    </w:p>
-    <w:p>
-      <w:pPr>
-        <w:spacing w:before="100" w:beforeAutospacing="1" w:after="100" w:afterAutospacing="1" w:line="240" w:lineRule="auto"/>
-        <w:rPr>
-          <w:rFonts w:ascii="Times New Roman" w:eastAsia="Times New Roman" w:hAnsi="Times New Roman" w:cs="Times New Roman"/>
-          <w:kern w:val="0"/>
-          <w14:ligatures w14:val="none"/>
-        </w:rPr>
-      </w:pPr>
-      <w:r>
-        <w:rPr>
-          <w:rFonts w:ascii="Times New Roman" w:eastAsia="Times New Roman" w:hAnsi="Times New Roman" w:cs="Times New Roman"/>
-          <w:kern w:val="0"/>
-          <w14:ligatures w14:val="none"/>
-        </w:rPr>
-        <w:t>This is part of the Futures Project's broader national data privacy and security framework, which applies across healthcare, labor, and government services.</w:t>
+        <w:t xml:space="preserve">All of this runs on a new privacy layer built around the patient. Your medical records follow you instead of being scattered across ten different doctors’ offices, hospital systems, </w:t>
+      </w:r>
+      <w:r>
+        <w:t>and insurance systems</w:t>
+      </w:r>
+      <w:r>
+        <w:t>. You control who can access them, and the system is designed so nobody sees more than they need to do their job.</w:t>
+      </w:r>
+    </w:p>
+    <w:p>
+      <w:pPr>
+        <w:pStyle w:val="NormalWeb"/>
+      </w:pPr>
+      <w:r>
+        <w:t xml:space="preserve">For healthcare to work, certain things have to be verified. The system needs to know whether you are covered, whether you qualify for a discount, whether a payment should go through, and what medical information your doctor needs to treat you. Today, </w:t>
+      </w:r>
+      <w:r>
+        <w:t xml:space="preserve">that often means pushing your sensitive information to way too many institutions. All of them have to store that information in order to do their job properly, and each time this happens, you reveal more information than you need to.  </w:t>
+      </w:r>
+    </w:p>
+    <w:p>
+      <w:pPr>
+        <w:pStyle w:val="NormalWeb"/>
+      </w:pPr>
+      <w:r>
+        <w:t xml:space="preserve">The new framework changes that. Your information sits behind a secure digital vault. When a provider, insurer, or payment system needs to verify </w:t>
+      </w:r>
+      <w:r>
+        <w:t xml:space="preserve">whether you qualify for </w:t>
+      </w:r>
+      <w:r>
+        <w:t xml:space="preserve">something, the vault </w:t>
+      </w:r>
+      <w:r>
+        <w:t>returns a yes or no answer on whether you qualify</w:t>
+      </w:r>
+      <w:r>
+        <w:t xml:space="preserve"> without exposing </w:t>
+      </w:r>
+      <w:r>
+        <w:t>your</w:t>
+      </w:r>
+      <w:r>
+        <w:t xml:space="preserve"> private information. It can confirm that you qualify for a discount without showing your income to the doctor’s office. It can confirm coverage without handing over your full insurance profile. It can settle a payment without exposing your medical history.</w:t>
+      </w:r>
+    </w:p>
+    <w:p>
+      <w:pPr>
+        <w:pStyle w:val="NormalWeb"/>
+      </w:pPr>
+      <w:r>
+        <w:t>The basic rule is simple: your doctor sees what they need to treat you. The payment system sees what it needs to complete the transaction. The eligibility system sees what it needs to confirm benefits. You see your records and control access. Nobody gets the whole file just because they touched one part of your care.</w:t>
+      </w:r>
+    </w:p>
+    <w:p>
+      <w:pPr>
+        <w:pStyle w:val="NormalWeb"/>
+      </w:pPr>
+      <w:r>
+        <w:t>This is part of the Futures Project’s broader national privacy and security framework, which applies across healthcare, labor, education, and government services.</w:t>
       </w:r>
     </w:p>
     <w:p>
@@ -3523,6 +3330,7 @@
           <w:kern w:val="0"/>
           <w14:ligatures w14:val="none"/>
         </w:rPr>
+        <w:lastRenderedPageBreak/>
         <w:t>If your employer wants to buy a supplemental insurance plan on top of that</w:t>
       </w:r>
       <w:r>
@@ -3698,7 +3506,6 @@
         <w:pStyle w:val="NormalWeb"/>
       </w:pPr>
       <w:r>
-        <w:lastRenderedPageBreak/>
         <w:t>Under this system, patient records are portable, structured, and consented. A physician no longer has to reconstruct a patient’s medical history on the spot from memory, fragmented portals, faxed records, and whatever the patient can remember under stress. The relevant record follows the patient, and the patient controls access.</w:t>
       </w:r>
     </w:p>
@@ -4052,6 +3859,7 @@
           <w:kern w:val="0"/>
           <w14:ligatures w14:val="none"/>
         </w:rPr>
+        <w:lastRenderedPageBreak/>
         <w:t xml:space="preserve">It also </w:t>
       </w:r>
       <w:r>
@@ -4376,16 +4184,7 @@
           <w:kern w:val="0"/>
           <w14:ligatures w14:val="none"/>
         </w:rPr>
-        <w:t xml:space="preserve">hese disaffected interests would have </w:t>
-      </w:r>
-      <w:r>
-        <w:rPr>
-          <w:rFonts w:ascii="Times New Roman" w:eastAsia="Times New Roman" w:hAnsi="Times New Roman" w:cs="Times New Roman"/>
-          <w:kern w:val="0"/>
-          <w14:ligatures w14:val="none"/>
-        </w:rPr>
-        <w:lastRenderedPageBreak/>
-        <w:t xml:space="preserve">everything to gain by running ads, news stories, </w:t>
+        <w:t xml:space="preserve">hese disaffected interests would have everything to gain by running ads, news stories, </w:t>
       </w:r>
       <w:r>
         <w:rPr>
@@ -4635,23 +4434,59 @@
           <w:kern w:val="0"/>
           <w14:ligatures w14:val="none"/>
         </w:rPr>
-        <w:t>Dental, maternal care, rural access, mental health, the full affordability gradient design</w:t>
-      </w:r>
-      <w:r>
-        <w:rPr>
-          <w:rFonts w:ascii="Times New Roman" w:eastAsia="Times New Roman" w:hAnsi="Times New Roman" w:cs="Times New Roman"/>
-          <w:kern w:val="0"/>
-          <w14:ligatures w14:val="none"/>
-        </w:rPr>
-        <w:t xml:space="preserve">, the digital data vault, </w:t>
-      </w:r>
-      <w:r>
-        <w:rPr>
-          <w:rFonts w:ascii="Times New Roman" w:eastAsia="Times New Roman" w:hAnsi="Times New Roman" w:cs="Times New Roman"/>
-          <w:kern w:val="0"/>
-          <w14:ligatures w14:val="none"/>
-        </w:rPr>
-        <w:t>are covered in the distillate and the individual policy briefs.</w:t>
+        <w:t xml:space="preserve">This is an overview document. </w:t>
+      </w:r>
+      <w:proofErr w:type="spellStart"/>
+      <w:r>
+        <w:rPr>
+          <w:rFonts w:ascii="Times New Roman" w:eastAsia="Times New Roman" w:hAnsi="Times New Roman" w:cs="Times New Roman"/>
+          <w:kern w:val="0"/>
+          <w14:ligatures w14:val="none"/>
+        </w:rPr>
+        <w:t>It’s</w:t>
+      </w:r>
+      <w:proofErr w:type="spellEnd"/>
+      <w:r>
+        <w:rPr>
+          <w:rFonts w:ascii="Times New Roman" w:eastAsia="Times New Roman" w:hAnsi="Times New Roman" w:cs="Times New Roman"/>
+          <w:kern w:val="0"/>
+          <w14:ligatures w14:val="none"/>
+        </w:rPr>
+        <w:t xml:space="preserve"> purpose is to take 8 documents, each of which being 10 – 20 pages </w:t>
+      </w:r>
+      <w:proofErr w:type="gramStart"/>
+      <w:r>
+        <w:rPr>
+          <w:rFonts w:ascii="Times New Roman" w:eastAsia="Times New Roman" w:hAnsi="Times New Roman" w:cs="Times New Roman"/>
+          <w:kern w:val="0"/>
+          <w14:ligatures w14:val="none"/>
+        </w:rPr>
+        <w:t xml:space="preserve">long, </w:t>
+      </w:r>
+      <w:r>
+        <w:rPr>
+          <w:rFonts w:ascii="Times New Roman" w:eastAsia="Times New Roman" w:hAnsi="Times New Roman" w:cs="Times New Roman"/>
+          <w:kern w:val="0"/>
+          <w14:ligatures w14:val="none"/>
+        </w:rPr>
+        <w:t>and</w:t>
+      </w:r>
+      <w:proofErr w:type="gramEnd"/>
+      <w:r>
+        <w:rPr>
+          <w:rFonts w:ascii="Times New Roman" w:eastAsia="Times New Roman" w:hAnsi="Times New Roman" w:cs="Times New Roman"/>
+          <w:kern w:val="0"/>
+          <w14:ligatures w14:val="none"/>
+        </w:rPr>
+        <w:t xml:space="preserve"> condense their general content into something someone can read in 10 minutes. As such each of the following have their own documents, describing how </w:t>
+      </w:r>
+      <w:r>
+        <w:rPr>
+          <w:rFonts w:ascii="Times New Roman" w:eastAsia="Times New Roman" w:hAnsi="Times New Roman" w:cs="Times New Roman"/>
+          <w:kern w:val="0"/>
+          <w14:ligatures w14:val="none"/>
+        </w:rPr>
+        <w:t xml:space="preserve">each works in detail: </w:t>
       </w:r>
     </w:p>
     <w:p>
@@ -4669,6 +4504,72 @@
           <w:kern w:val="0"/>
           <w14:ligatures w14:val="none"/>
         </w:rPr>
+        <w:t>Dental</w:t>
+      </w:r>
+      <w:r>
+        <w:rPr>
+          <w:rFonts w:ascii="Times New Roman" w:eastAsia="Times New Roman" w:hAnsi="Times New Roman" w:cs="Times New Roman"/>
+          <w:kern w:val="0"/>
+          <w14:ligatures w14:val="none"/>
+        </w:rPr>
+        <w:t xml:space="preserve"> care</w:t>
+      </w:r>
+      <w:r>
+        <w:rPr>
+          <w:rFonts w:ascii="Times New Roman" w:eastAsia="Times New Roman" w:hAnsi="Times New Roman" w:cs="Times New Roman"/>
+          <w:kern w:val="0"/>
+          <w14:ligatures w14:val="none"/>
+        </w:rPr>
+        <w:t>, maternal care, rural access, mental health, the full affordability gradient design</w:t>
+      </w:r>
+      <w:r>
+        <w:rPr>
+          <w:rFonts w:ascii="Times New Roman" w:eastAsia="Times New Roman" w:hAnsi="Times New Roman" w:cs="Times New Roman"/>
+          <w:kern w:val="0"/>
+          <w14:ligatures w14:val="none"/>
+        </w:rPr>
+        <w:t xml:space="preserve">, </w:t>
+      </w:r>
+      <w:r>
+        <w:rPr>
+          <w:rFonts w:ascii="Times New Roman" w:eastAsia="Times New Roman" w:hAnsi="Times New Roman" w:cs="Times New Roman"/>
+          <w:kern w:val="0"/>
+          <w14:ligatures w14:val="none"/>
+        </w:rPr>
+        <w:t xml:space="preserve">and </w:t>
+      </w:r>
+      <w:r>
+        <w:rPr>
+          <w:rFonts w:ascii="Times New Roman" w:eastAsia="Times New Roman" w:hAnsi="Times New Roman" w:cs="Times New Roman"/>
+          <w:kern w:val="0"/>
+          <w14:ligatures w14:val="none"/>
+        </w:rPr>
+        <w:t xml:space="preserve">the </w:t>
+      </w:r>
+      <w:r>
+        <w:rPr>
+          <w:rFonts w:ascii="Times New Roman" w:eastAsia="Times New Roman" w:hAnsi="Times New Roman" w:cs="Times New Roman"/>
+          <w:kern w:val="0"/>
+          <w14:ligatures w14:val="none"/>
+        </w:rPr>
+        <w:t xml:space="preserve">data privacy framework all have their own documents. </w:t>
+      </w:r>
+    </w:p>
+    <w:p>
+      <w:pPr>
+        <w:spacing w:before="100" w:beforeAutospacing="1" w:after="100" w:afterAutospacing="1" w:line="240" w:lineRule="auto"/>
+        <w:rPr>
+          <w:rFonts w:ascii="Times New Roman" w:eastAsia="Times New Roman" w:hAnsi="Times New Roman" w:cs="Times New Roman"/>
+          <w:kern w:val="0"/>
+          <w14:ligatures w14:val="none"/>
+        </w:rPr>
+      </w:pPr>
+      <w:r>
+        <w:rPr>
+          <w:rFonts w:ascii="Times New Roman" w:eastAsia="Times New Roman" w:hAnsi="Times New Roman" w:cs="Times New Roman"/>
+          <w:kern w:val="0"/>
+          <w14:ligatures w14:val="none"/>
+        </w:rPr>
         <w:t xml:space="preserve">Pharmaceuticals </w:t>
       </w:r>
       <w:r>
@@ -4701,7 +4602,23 @@
           <w:kern w:val="0"/>
           <w14:ligatures w14:val="none"/>
         </w:rPr>
-        <w:t xml:space="preserve"> have their own overview.</w:t>
+        <w:t xml:space="preserve"> have their own overview</w:t>
+      </w:r>
+      <w:r>
+        <w:rPr>
+          <w:rFonts w:ascii="Times New Roman" w:eastAsia="Times New Roman" w:hAnsi="Times New Roman" w:cs="Times New Roman"/>
+          <w:kern w:val="0"/>
+          <w14:ligatures w14:val="none"/>
+        </w:rPr>
+        <w:t xml:space="preserve"> and their own documents</w:t>
+      </w:r>
+      <w:r>
+        <w:rPr>
+          <w:rFonts w:ascii="Times New Roman" w:eastAsia="Times New Roman" w:hAnsi="Times New Roman" w:cs="Times New Roman"/>
+          <w:kern w:val="0"/>
+          <w14:ligatures w14:val="none"/>
+        </w:rPr>
+        <w:t>.</w:t>
       </w:r>
     </w:p>
     <w:p>
@@ -4735,23 +4652,63 @@
           <w:kern w:val="0"/>
           <w14:ligatures w14:val="none"/>
         </w:rPr>
-        <w:t xml:space="preserve">how we get from the current system to this one, in what order, over what timeline, with what safeguards </w:t>
-      </w:r>
-      <w:r>
-        <w:rPr>
-          <w:rFonts w:ascii="Times New Roman" w:eastAsia="Times New Roman" w:hAnsi="Times New Roman" w:cs="Times New Roman"/>
-          <w:kern w:val="0"/>
-          <w14:ligatures w14:val="none"/>
-        </w:rPr>
-        <w:t>--</w:t>
-      </w:r>
-      <w:r>
-        <w:rPr>
-          <w:rFonts w:ascii="Times New Roman" w:eastAsia="Times New Roman" w:hAnsi="Times New Roman" w:cs="Times New Roman"/>
-          <w:kern w:val="0"/>
-          <w14:ligatures w14:val="none"/>
-        </w:rPr>
-        <w:t xml:space="preserve"> have their own overview</w:t>
+        <w:t xml:space="preserve">how we get from </w:t>
+      </w:r>
+      <w:r>
+        <w:rPr>
+          <w:rFonts w:ascii="Times New Roman" w:eastAsia="Times New Roman" w:hAnsi="Times New Roman" w:cs="Times New Roman"/>
+          <w:kern w:val="0"/>
+          <w14:ligatures w14:val="none"/>
+        </w:rPr>
+        <w:t xml:space="preserve">our </w:t>
+      </w:r>
+      <w:r>
+        <w:rPr>
+          <w:rFonts w:ascii="Times New Roman" w:eastAsia="Times New Roman" w:hAnsi="Times New Roman" w:cs="Times New Roman"/>
+          <w:kern w:val="0"/>
+          <w14:ligatures w14:val="none"/>
+        </w:rPr>
+        <w:t xml:space="preserve">current system to </w:t>
+      </w:r>
+      <w:r>
+        <w:rPr>
+          <w:rFonts w:ascii="Times New Roman" w:eastAsia="Times New Roman" w:hAnsi="Times New Roman" w:cs="Times New Roman"/>
+          <w:kern w:val="0"/>
+          <w14:ligatures w14:val="none"/>
+        </w:rPr>
+        <w:t>the new one</w:t>
+      </w:r>
+      <w:r>
+        <w:rPr>
+          <w:rFonts w:ascii="Times New Roman" w:eastAsia="Times New Roman" w:hAnsi="Times New Roman" w:cs="Times New Roman"/>
+          <w:kern w:val="0"/>
+          <w14:ligatures w14:val="none"/>
+        </w:rPr>
+        <w:t xml:space="preserve">, in what order, over what timeline, with what safeguards </w:t>
+      </w:r>
+      <w:r>
+        <w:rPr>
+          <w:rFonts w:ascii="Times New Roman" w:eastAsia="Times New Roman" w:hAnsi="Times New Roman" w:cs="Times New Roman"/>
+          <w:kern w:val="0"/>
+          <w14:ligatures w14:val="none"/>
+        </w:rPr>
+        <w:t>–</w:t>
+      </w:r>
+      <w:r>
+        <w:rPr>
+          <w:rFonts w:ascii="Times New Roman" w:eastAsia="Times New Roman" w:hAnsi="Times New Roman" w:cs="Times New Roman"/>
+          <w:kern w:val="0"/>
+          <w14:ligatures w14:val="none"/>
+        </w:rPr>
+        <w:t xml:space="preserve"> </w:t>
+      </w:r>
+      <w:r>
+        <w:rPr>
+          <w:rFonts w:ascii="Times New Roman" w:eastAsia="Times New Roman" w:hAnsi="Times New Roman" w:cs="Times New Roman"/>
+          <w:kern w:val="0"/>
+          <w14:ligatures w14:val="none"/>
+        </w:rPr>
+        <w:t>have their own overview and their own documents</w:t>
       </w:r>
       <w:r>
         <w:rPr>
@@ -4801,15 +4758,39 @@
           <w:kern w:val="0"/>
           <w14:ligatures w14:val="none"/>
         </w:rPr>
-        <w:t xml:space="preserve"> --</w:t>
-      </w:r>
-      <w:r>
-        <w:rPr>
-          <w:rFonts w:ascii="Times New Roman" w:eastAsia="Times New Roman" w:hAnsi="Times New Roman" w:cs="Times New Roman"/>
-          <w:kern w:val="0"/>
-          <w14:ligatures w14:val="none"/>
-        </w:rPr>
-        <w:t xml:space="preserve"> has its own overview. Because you cannot fix healthcare spending without eventually addressing the conditions that drive most of it.</w:t>
+        <w:t xml:space="preserve"> </w:t>
+      </w:r>
+      <w:r>
+        <w:rPr>
+          <w:rFonts w:ascii="Times New Roman" w:eastAsia="Times New Roman" w:hAnsi="Times New Roman" w:cs="Times New Roman"/>
+          <w:kern w:val="0"/>
+          <w14:ligatures w14:val="none"/>
+        </w:rPr>
+        <w:t>–</w:t>
+      </w:r>
+      <w:r>
+        <w:rPr>
+          <w:rFonts w:ascii="Times New Roman" w:eastAsia="Times New Roman" w:hAnsi="Times New Roman" w:cs="Times New Roman"/>
+          <w:kern w:val="0"/>
+          <w14:ligatures w14:val="none"/>
+        </w:rPr>
+        <w:t xml:space="preserve"> </w:t>
+      </w:r>
+      <w:r>
+        <w:rPr>
+          <w:rFonts w:ascii="Times New Roman" w:eastAsia="Times New Roman" w:hAnsi="Times New Roman" w:cs="Times New Roman"/>
+          <w:kern w:val="0"/>
+          <w14:ligatures w14:val="none"/>
+        </w:rPr>
+        <w:t>have their own overview and documents</w:t>
+      </w:r>
+      <w:r>
+        <w:rPr>
+          <w:rFonts w:ascii="Times New Roman" w:eastAsia="Times New Roman" w:hAnsi="Times New Roman" w:cs="Times New Roman"/>
+          <w:kern w:val="0"/>
+          <w14:ligatures w14:val="none"/>
+        </w:rPr>
+        <w:t>. Because you cannot fix healthcare spending without eventually addressing the conditions that drive most of it.</w:t>
       </w:r>
     </w:p>
     <w:p>
@@ -4883,6 +4864,7 @@
           <w:kern w:val="0"/>
           <w14:ligatures w14:val="none"/>
         </w:rPr>
+        <w:lastRenderedPageBreak/>
         <w:t xml:space="preserve">The American healthcare system costs more than any comparable country. It delivers worse outcomes. It bankrupts </w:t>
       </w:r>
       <w:r>
@@ -5247,7 +5229,6 @@
           <w:kern w:val="0"/>
           <w14:ligatures w14:val="none"/>
         </w:rPr>
-        <w:lastRenderedPageBreak/>
         <w:t>The bar is not perfection. The bar is better than $5.3 trillion disappearing into a black box every year while people go bankrupt getting sick.</w:t>
       </w:r>
       <w:r>

</xml_diff>